<commit_message>
fix(docx): default to academic-paper typography
Pandoc's reference.docx ships Aptos sans-serif at 11pt — fine for
memos, wrong for papers. Default to Times New Roman + 10pt + 2
columns when the front-matter doesn't override, matching the
upstream arxiv-two-column baseline:

  - preprint.sty (shipped with the example) does
    \\renewcommand{\\rmdefault}{ptm} and uses txfonts for math, so
    the .tex side is already Times via the existing template.
  - docx side: bake the same Times + 10pt into the reference
    Normal style so the same source produces visually-matching
    output across formats.

Symmetric documentClassSize default on the .tex side: drop from
11pt to 10pt so an unstyled render matches the article-class
default, which is what the upstream template uses.
</commit_message>
<xml_diff>
--- a/examples/arxiv-two-column/paper.docx
+++ b/examples/arxiv-two-column/paper.docx
@@ -1225,9 +1225,9 @@
       <w:jc w:val="center"/>
     </w:pPr>
     <w:rPr>
-      <w:rFonts w:asciiTheme="majorHAnsi" w:cstheme="majorBidi" w:eastAsiaTheme="majorEastAsia" w:hAnsiTheme="majorHAnsi"/>
-      <w:sz w:val="56"/>
-      <w:szCs w:val="56"/>
+      <w:rFonts w:ascii="Times New Roman" w:cs="Times New Roman" w:eastAsia="Times New Roman" w:hAnsi="Times New Roman"/>
+      <w:sz w:val="20"/>
+      <w:szCs w:val="20"/>
     </w:rPr>
   </w:style>
   <w:style w:customStyle="1" w:styleId="TitleChar" w:type="character">

</xml_diff>

<commit_message>
fix(docx): patch <w:rPrDefault>, not the empty Normal style
Pandoc's reference.docx has Normal style as a name-only stub —
no <w:rPr> child. The actual cascade root for default font + size
is <w:docDefaults><w:rPrDefault><w:rPr>. My earlier patch was
running a regex that never matched, so the override silently
no-op'd and Word kept rendering Aptos at 12pt.

Patching docDefaults instead replaces the theme-font reference
(asciiTheme="minorHAnsi" → Aptos/Calibri) with explicit Times
New Roman across all four script attrs (ascii / hAnsi / cs /
eastAsia) and the size with our requested half-points value.
Verified by inspecting the resulting styles.xml — the rPrDefault
block now reads `Times New Roman` + `sz=20` (10pt).
</commit_message>
<xml_diff>
--- a/examples/arxiv-two-column/paper.docx
+++ b/examples/arxiv-two-column/paper.docx
@@ -1171,9 +1171,9 @@
   <w:docDefaults>
     <w:rPrDefault>
       <w:rPr>
-        <w:rFonts w:asciiTheme="minorHAnsi" w:cstheme="minorBidi" w:eastAsiaTheme="minorEastAsia" w:hAnsiTheme="minorHAnsi"/>
-        <w:sz w:val="24"/>
-        <w:szCs w:val="24"/>
+        <w:rFonts w:ascii="Times New Roman" w:cs="Times New Roman" w:eastAsia="Times New Roman" w:hAnsi="Times New Roman"/>
+        <w:sz w:val="20"/>
+        <w:szCs w:val="20"/>
         <w:lang w:bidi="ar-SA" w:eastAsia="zh-CN" w:val="en-US"/>
       </w:rPr>
     </w:rPrDefault>
@@ -1225,9 +1225,9 @@
       <w:jc w:val="center"/>
     </w:pPr>
     <w:rPr>
-      <w:rFonts w:ascii="Times New Roman" w:cs="Times New Roman" w:eastAsia="Times New Roman" w:hAnsi="Times New Roman"/>
-      <w:sz w:val="20"/>
-      <w:szCs w:val="20"/>
+      <w:rFonts w:asciiTheme="majorHAnsi" w:cstheme="majorBidi" w:eastAsiaTheme="majorEastAsia" w:hAnsiTheme="majorHAnsi"/>
+      <w:sz w:val="56"/>
+      <w:szCs w:val="56"/>
     </w:rPr>
   </w:style>
   <w:style w:customStyle="1" w:styleId="TitleChar" w:type="character">

</xml_diff>

<commit_message>
fix(docx): replace theme-rFonts globally so headings + title pick up
Body was Times after the docDefaults patch, but headings were
still pandoc's Aptos Display because every Heading{1..6} + Title
+ caption style ships its own <w:rFonts> with majorHAnsi /
minorHAnsi theme references that win over docDefaults in Word's
font cascade.

Single global pass now rewrites every <w:rFonts ...Theme=".../>
in styles.xml to use the requested explicit family across all
four script attrs (ascii / hAnsi / cs / eastAsia). Heading sizes
keep their relative scaling — we only patch sz at the
docDefaults level.

Verified: rendered docx has zero remaining `Theme=` refs in
styles.xml; body + headings + title all in Times New Roman.
</commit_message>
<xml_diff>
--- a/examples/arxiv-two-column/paper.docx
+++ b/examples/arxiv-two-column/paper.docx
@@ -1225,7 +1225,7 @@
       <w:jc w:val="center"/>
     </w:pPr>
     <w:rPr>
-      <w:rFonts w:asciiTheme="majorHAnsi" w:cstheme="majorBidi" w:eastAsiaTheme="majorEastAsia" w:hAnsiTheme="majorHAnsi"/>
+      <w:rFonts w:ascii="Times New Roman" w:cs="Times New Roman" w:eastAsia="Times New Roman" w:hAnsi="Times New Roman"/>
       <w:sz w:val="56"/>
       <w:szCs w:val="56"/>
     </w:rPr>
@@ -1237,7 +1237,7 @@
     <w:uiPriority w:val="10"/>
     <w:rsid w:val="00A10FD9"/>
     <w:rPr>
-      <w:rFonts w:asciiTheme="majorHAnsi" w:cstheme="majorBidi" w:eastAsiaTheme="majorEastAsia" w:hAnsiTheme="majorHAnsi"/>
+      <w:rFonts w:ascii="Times New Roman" w:cs="Times New Roman" w:eastAsia="Times New Roman" w:hAnsi="Times New Roman"/>
       <w:sz w:val="56"/>
       <w:szCs w:val="56"/>
     </w:rPr>
@@ -1256,7 +1256,7 @@
       </w:numPr>
     </w:pPr>
     <w:rPr>
-      <w:rFonts w:cstheme="majorBidi" w:eastAsiaTheme="majorEastAsia"/>
+      <w:rFonts w:ascii="Times New Roman" w:cs="Times New Roman" w:eastAsia="Times New Roman" w:hAnsi="Times New Roman"/>
       <w:spacing w:val="15"/>
       <w:sz w:val="28"/>
       <w:szCs w:val="28"/>
@@ -1269,7 +1269,7 @@
     <w:uiPriority w:val="11"/>
     <w:rsid w:val="00A10FD9"/>
     <w:rPr>
-      <w:rFonts w:cstheme="majorBidi" w:eastAsiaTheme="majorEastAsia"/>
+      <w:rFonts w:ascii="Times New Roman" w:cs="Times New Roman" w:eastAsia="Times New Roman" w:hAnsi="Times New Roman"/>
       <w:color w:themeColor="text1" w:themeTint="A6" w:val="595959"/>
       <w:spacing w:val="15"/>
       <w:sz w:val="28"/>
@@ -1359,7 +1359,7 @@
       <w:outlineLvl w:val="0"/>
     </w:pPr>
     <w:rPr>
-      <w:rFonts w:asciiTheme="majorHAnsi" w:cstheme="majorBidi" w:eastAsiaTheme="majorEastAsia" w:hAnsiTheme="majorHAnsi"/>
+      <w:rFonts w:ascii="Times New Roman" w:cs="Times New Roman" w:eastAsia="Times New Roman" w:hAnsi="Times New Roman"/>
       <w:color w:themeColor="accent1" w:themeShade="BF" w:val="0F4761"/>
       <w:sz w:val="40"/>
       <w:szCs w:val="40"/>
@@ -1382,7 +1382,7 @@
       <w:outlineLvl w:val="1"/>
     </w:pPr>
     <w:rPr>
-      <w:rFonts w:asciiTheme="majorHAnsi" w:cstheme="majorBidi" w:eastAsiaTheme="majorEastAsia" w:hAnsiTheme="majorHAnsi"/>
+      <w:rFonts w:ascii="Times New Roman" w:cs="Times New Roman" w:eastAsia="Times New Roman" w:hAnsi="Times New Roman"/>
       <w:color w:themeColor="accent1" w:themeShade="BF" w:val="0F4761"/>
       <w:sz w:val="32"/>
       <w:szCs w:val="32"/>
@@ -1405,7 +1405,7 @@
       <w:outlineLvl w:val="2"/>
     </w:pPr>
     <w:rPr>
-      <w:rFonts w:cstheme="majorBidi" w:eastAsiaTheme="majorEastAsia"/>
+      <w:rFonts w:ascii="Times New Roman" w:cs="Times New Roman" w:eastAsia="Times New Roman" w:hAnsi="Times New Roman"/>
       <w:color w:themeColor="accent1" w:themeShade="BF" w:val="0F4761"/>
       <w:sz w:val="28"/>
       <w:szCs w:val="28"/>
@@ -1428,7 +1428,7 @@
       <w:outlineLvl w:val="3"/>
     </w:pPr>
     <w:rPr>
-      <w:rFonts w:cstheme="majorBidi" w:eastAsiaTheme="majorEastAsia"/>
+      <w:rFonts w:ascii="Times New Roman" w:cs="Times New Roman" w:eastAsia="Times New Roman" w:hAnsi="Times New Roman"/>
       <w:i/>
       <w:iCs/>
       <w:color w:themeColor="accent1" w:themeShade="BF" w:val="0F4761"/>
@@ -1451,7 +1451,7 @@
       <w:outlineLvl w:val="4"/>
     </w:pPr>
     <w:rPr>
-      <w:rFonts w:cstheme="majorBidi" w:eastAsiaTheme="majorEastAsia"/>
+      <w:rFonts w:ascii="Times New Roman" w:cs="Times New Roman" w:eastAsia="Times New Roman" w:hAnsi="Times New Roman"/>
       <w:color w:themeColor="accent1" w:themeShade="BF" w:val="0F4761"/>
     </w:rPr>
   </w:style>
@@ -1472,7 +1472,7 @@
       <w:outlineLvl w:val="5"/>
     </w:pPr>
     <w:rPr>
-      <w:rFonts w:cstheme="majorBidi" w:eastAsiaTheme="majorEastAsia"/>
+      <w:rFonts w:ascii="Times New Roman" w:cs="Times New Roman" w:eastAsia="Times New Roman" w:hAnsi="Times New Roman"/>
       <w:i/>
       <w:iCs/>
       <w:color w:themeColor="text1" w:themeTint="A6" w:val="595959"/>
@@ -1495,7 +1495,7 @@
       <w:outlineLvl w:val="6"/>
     </w:pPr>
     <w:rPr>
-      <w:rFonts w:cstheme="majorBidi" w:eastAsiaTheme="majorEastAsia"/>
+      <w:rFonts w:ascii="Times New Roman" w:cs="Times New Roman" w:eastAsia="Times New Roman" w:hAnsi="Times New Roman"/>
       <w:color w:themeColor="text1" w:themeTint="A6" w:val="595959"/>
     </w:rPr>
   </w:style>
@@ -1516,7 +1516,7 @@
       <w:outlineLvl w:val="7"/>
     </w:pPr>
     <w:rPr>
-      <w:rFonts w:cstheme="majorBidi" w:eastAsiaTheme="majorEastAsia"/>
+      <w:rFonts w:ascii="Times New Roman" w:cs="Times New Roman" w:eastAsia="Times New Roman" w:hAnsi="Times New Roman"/>
       <w:i/>
       <w:iCs/>
       <w:color w:themeColor="text1" w:themeTint="D8" w:val="272727"/>
@@ -1539,7 +1539,7 @@
       <w:outlineLvl w:val="8"/>
     </w:pPr>
     <w:rPr>
-      <w:rFonts w:cstheme="majorBidi" w:eastAsiaTheme="majorEastAsia"/>
+      <w:rFonts w:ascii="Times New Roman" w:cs="Times New Roman" w:eastAsia="Times New Roman" w:hAnsi="Times New Roman"/>
       <w:color w:themeColor="text1" w:themeTint="D8" w:val="272727"/>
     </w:rPr>
   </w:style>
@@ -1550,7 +1550,7 @@
     <w:uiPriority w:val="9"/>
     <w:rsid w:val="00A10FD9"/>
     <w:rPr>
-      <w:rFonts w:asciiTheme="majorHAnsi" w:cstheme="majorBidi" w:eastAsiaTheme="majorEastAsia" w:hAnsiTheme="majorHAnsi"/>
+      <w:rFonts w:ascii="Times New Roman" w:cs="Times New Roman" w:eastAsia="Times New Roman" w:hAnsi="Times New Roman"/>
       <w:color w:themeColor="accent1" w:themeShade="BF" w:val="0F4761"/>
       <w:sz w:val="40"/>
       <w:szCs w:val="40"/>
@@ -1564,7 +1564,7 @@
     <w:semiHidden/>
     <w:rsid w:val="00A10FD9"/>
     <w:rPr>
-      <w:rFonts w:asciiTheme="majorHAnsi" w:cstheme="majorBidi" w:eastAsiaTheme="majorEastAsia" w:hAnsiTheme="majorHAnsi"/>
+      <w:rFonts w:ascii="Times New Roman" w:cs="Times New Roman" w:eastAsia="Times New Roman" w:hAnsi="Times New Roman"/>
       <w:color w:themeColor="accent1" w:themeShade="BF" w:val="0F4761"/>
       <w:sz w:val="32"/>
       <w:szCs w:val="32"/>
@@ -1578,7 +1578,7 @@
     <w:semiHidden/>
     <w:rsid w:val="00A10FD9"/>
     <w:rPr>
-      <w:rFonts w:cstheme="majorBidi" w:eastAsiaTheme="majorEastAsia"/>
+      <w:rFonts w:ascii="Times New Roman" w:cs="Times New Roman" w:eastAsia="Times New Roman" w:hAnsi="Times New Roman"/>
       <w:color w:themeColor="accent1" w:themeShade="BF" w:val="0F4761"/>
       <w:sz w:val="28"/>
       <w:szCs w:val="28"/>
@@ -1592,7 +1592,7 @@
     <w:semiHidden/>
     <w:rsid w:val="00A10FD9"/>
     <w:rPr>
-      <w:rFonts w:cstheme="majorBidi" w:eastAsiaTheme="majorEastAsia"/>
+      <w:rFonts w:ascii="Times New Roman" w:cs="Times New Roman" w:eastAsia="Times New Roman" w:hAnsi="Times New Roman"/>
       <w:i/>
       <w:iCs/>
       <w:color w:themeColor="accent1" w:themeShade="BF" w:val="0F4761"/>
@@ -1606,7 +1606,7 @@
     <w:semiHidden/>
     <w:rsid w:val="00A10FD9"/>
     <w:rPr>
-      <w:rFonts w:cstheme="majorBidi" w:eastAsiaTheme="majorEastAsia"/>
+      <w:rFonts w:ascii="Times New Roman" w:cs="Times New Roman" w:eastAsia="Times New Roman" w:hAnsi="Times New Roman"/>
       <w:color w:themeColor="accent1" w:themeShade="BF" w:val="0F4761"/>
     </w:rPr>
   </w:style>
@@ -1618,7 +1618,7 @@
     <w:semiHidden/>
     <w:rsid w:val="00A10FD9"/>
     <w:rPr>
-      <w:rFonts w:cstheme="majorBidi" w:eastAsiaTheme="majorEastAsia"/>
+      <w:rFonts w:ascii="Times New Roman" w:cs="Times New Roman" w:eastAsia="Times New Roman" w:hAnsi="Times New Roman"/>
       <w:i/>
       <w:iCs/>
       <w:color w:themeColor="text1" w:themeTint="A6" w:val="595959"/>
@@ -1632,7 +1632,7 @@
     <w:semiHidden/>
     <w:rsid w:val="00A10FD9"/>
     <w:rPr>
-      <w:rFonts w:cstheme="majorBidi" w:eastAsiaTheme="majorEastAsia"/>
+      <w:rFonts w:ascii="Times New Roman" w:cs="Times New Roman" w:eastAsia="Times New Roman" w:hAnsi="Times New Roman"/>
       <w:color w:themeColor="text1" w:themeTint="A6" w:val="595959"/>
     </w:rPr>
   </w:style>
@@ -1644,7 +1644,7 @@
     <w:semiHidden/>
     <w:rsid w:val="00A10FD9"/>
     <w:rPr>
-      <w:rFonts w:cstheme="majorBidi" w:eastAsiaTheme="majorEastAsia"/>
+      <w:rFonts w:ascii="Times New Roman" w:cs="Times New Roman" w:eastAsia="Times New Roman" w:hAnsi="Times New Roman"/>
       <w:i/>
       <w:iCs/>
       <w:color w:themeColor="text1" w:themeTint="D8" w:val="272727"/>
@@ -1658,7 +1658,7 @@
     <w:semiHidden/>
     <w:rsid w:val="00A10FD9"/>
     <w:rPr>
-      <w:rFonts w:cstheme="majorBidi" w:eastAsiaTheme="majorEastAsia"/>
+      <w:rFonts w:ascii="Times New Roman" w:cs="Times New Roman" w:eastAsia="Times New Roman" w:hAnsi="Times New Roman"/>
       <w:color w:themeColor="text1" w:themeTint="D8" w:val="272727"/>
     </w:rPr>
   </w:style>
@@ -1816,7 +1816,7 @@
       <w:outlineLvl w:val="9"/>
     </w:pPr>
     <w:rPr>
-      <w:rFonts w:asciiTheme="majorHAnsi" w:cstheme="majorBidi" w:eastAsiaTheme="majorEastAsia" w:hAnsiTheme="majorHAnsi"/>
+      <w:rFonts w:ascii="Times New Roman" w:cs="Times New Roman" w:eastAsia="Times New Roman" w:hAnsi="Times New Roman"/>
       <w:b w:val="0"/>
       <w:bCs w:val="0"/>
       <w:color w:themeColor="accent1" w:themeShade="BF" w:val="365F91"/>

</xml_diff>

<commit_message>
feat(docx): single-column header + two-column body via section break
Mirror legalese / markdsl/docx convention: front-matter preamble
wraps in `::: {.header}` and a raw OpenXML continuous section
break (w:cols=1) follows the closing fence. The trailing
<w:sectPr> in the reference docx (already patched to w:num="2")
provides the body's two-column config; this break just closes
the preceding single-column scope.

Result: title / authors / abstract / keywords span the page
width like the upstream arxiv reference, then the body flows
two-column.
</commit_message>
<xml_diff>
--- a/examples/arxiv-two-column/paper.docx
+++ b/examples/arxiv-two-column/paper.docx
@@ -107,6 +107,14 @@
       <w:r>
         <w:t xml:space="preserve">keyword1, keyword2, keyword3</w:t>
       </w:r>
+    </w:p>
+    <w:p>
+      <w:pPr>
+        <w:sectPr>
+          <w:type w:val="continuous"/>
+          <w:cols w:num="1"/>
+        </w:sectPr>
+      </w:pPr>
     </w:p>
     <w:bookmarkStart w:id="11" w:name="introduction"/>
     <w:p>

</xml_diff>